<commit_message>
Hub: PA5/PA5.5 outside-friends-and-family rule (hub-only deploy)
</commit_message>
<xml_diff>
--- a/hub/files/PA5.5.docx
+++ b/hub/files/PA5.5.docx
@@ -255,7 +255,16 @@
         <w:t>5 completed, qualified surveys</w:t>
       </w:r>
       <w:r>
-        <w:t xml:space="preserve"> following your team's PA5 plan, then report how it actually went. The core of the report is four numbers kept distinct — contacts → qualified → completes → counted — and the response rate they imply. Your five join the combined pool (this class's wave + the existing student survey + the aytm n = 600 benchmark) that your PA6/PA7 analysis runs on.</w:t>
+        <w:t xml:space="preserve"> following your team's PA5 plan, then report how it actually went. Up to 3 of your 5 may come from friends and family; </w:t>
+      </w:r>
+      <w:r>
+        <w:rPr>
+          <w:b/>
+        </w:rPr>
+        <w:t>at least 2 must come from people outside friends and family</w:t>
+      </w:r>
+      <w:r>
+        <w:t xml:space="preserve"> (people you did not know before, reached at a named venue or through a named local community channel). The core of the report is four numbers kept distinct — contacts → qualified → completes → counted — and the response rate they imply. Your five join the combined pool (this class's wave + the existing student survey + the aytm n = 600 benchmark) that your PA6/PA7 analysis runs on.</w:t>
       </w:r>
     </w:p>
     <w:p>
@@ -317,7 +326,7 @@
         <w:t>before</w:t>
       </w:r>
       <w:r>
-        <w:t xml:space="preserve"> you pitch: qualified = passes the screeners (homeowner / usable outdoor space). Respondents who terminate at a screener are useful contacts but do not count toward your 5. Collecting beyond 5 is welcome — it strengthens the team pool.</w:t>
+        <w:t xml:space="preserve"> you pitch: qualified = passes the screeners (homeowner / usable outdoor space). Respondents who terminate at a screener are useful contacts but do not count toward your 5. Of your counted 5, at least 2 must be from outside friends and family; classmates never count. Collecting beyond 5 is welcome — it strengthens the team pool.</w:t>
       </w:r>
     </w:p>
     <w:p>
@@ -335,7 +344,7 @@
         <w:t>Track the four numbers as you go:</w:t>
       </w:r>
       <w:r>
-        <w:t xml:space="preserve"> contacts made (estimates OK) → qualified (passed screeners) → completes → counted toward your quota (selected your name). They are four different numbers — keep them distinct, per channel where you can. Your Counted column must match the Form responses that selected your name; the instructor checks it against the Form.</w:t>
+        <w:t xml:space="preserve"> contacts made (estimates OK) → qualified (passed screeners) → completes → counted toward your quota (selected your name). They are four different numbers — keep them distinct, per channel, with friends and family as its own channel row. Your Counted column must match the Form responses that selected your name; the instructor checks it against the Form.</w:t>
       </w:r>
     </w:p>
     <w:p>
@@ -430,7 +439,7 @@
         <w:t xml:space="preserve">☐  </w:t>
       </w:r>
       <w:r>
-        <w:t>Filled four-number funnel + response rate (Appendix A)</w:t>
+        <w:t>Filled four-number funnel + response rate (Appendix A), with at least 2 counted completes from outside friends and family</w:t>
       </w:r>
     </w:p>
     <w:p>
@@ -649,7 +658,7 @@
               <w:rPr>
                 <w:sz w:val="19"/>
               </w:rPr>
-              <w:t>Screened before the ask, with the verbal screener wording stated; channels chosen for homeowner fit, not convenience alone</w:t>
+              <w:t>Screened before the ask, with the verbal screener wording stated; at least 2 of your counted 5 from outside friends and family, through channels chosen for homeowner fit</w:t>
             </w:r>
           </w:p>
         </w:tc>

</xml_diff>